<commit_message>
Update portal + service agreement: new pricing ,500, Aug 14 deadline, remove complimentary period
</commit_message>
<xml_diff>
--- a/proposals/ABWLuxuryLimousine/docs/AIGlamTech_ServiceAgreement_BrianWalcott.docx
+++ b/proposals/ABWLuxuryLimousine/docs/AIGlamTech_ServiceAgreement_BrianWalcott.docx
@@ -773,7 +773,7 @@
           <w:sz w:val="20"/>
           <w:szCs w:val="20"/>
         </w:rPr>
-        <w:t xml:space="preserve">•  Ongoing tuning and script adjustments during 60-day complimentary period (see Section 3)</w:t>
+        <w:t xml:space="preserve">•  Ongoing tuning and script adjustments included in monthly AI System Care retainer (see Section 3C)</w:t>
       </w:r>
     </w:p>
     <w:p>
@@ -1216,7 +1216,9 @@
           <w:sz w:val="20"/>
           <w:szCs w:val="20"/>
         </w:rPr>
-        <w:t xml:space="preserve">$2,500.00 — due before work begins. This fee covers the full Phase 1 build: ADESINA™ setup, Twilio integration, GHL CRM build, N8N post-call and refund workflows, Stripe setup, and QR code/Dot Card delivery.</w:t>
+        <w:t xml:space="preserve">$3,500.00 — total one-time setup fee covering the full Phase 1 build: ADESINA™ setup, Twilio integration, GHL CRM build, N8N post-call and refund workflows, Stripe setup, and QR code/Dot Card delivery.
+Payment structure: $2,000.00 deposit is due at signing before work begins. The remaining balance of $1,500.00 is due within three (3) weeks of the signing date. The AI system will not be delivered or activated until the full $3,500.00 setup fee is paid and monthly autopay is active.
+Pricing Validity: This setup fee of $3,500.00 is valid only if the Agreement is signed and the $2,000.00 deposit is received on or before August 14, 2026. After that date, the standard setup fee of $4,700.00 applies.</w:t>
       </w:r>
     </w:p>
     <w:p>
@@ -1236,7 +1238,7 @@
           <w:sz w:val="22"/>
           <w:szCs w:val="22"/>
         </w:rPr>
-        <w:t xml:space="preserve">B.  60-Day Complimentary Support Period</w:t>
+        <w:t xml:space="preserve">C.  Monthly Retainer — AI System Care</w:t>
       </w:r>
     </w:p>
     <w:p>
@@ -1249,7 +1251,169 @@
           <w:sz w:val="20"/>
           <w:szCs w:val="20"/>
         </w:rPr>
-        <w:t xml:space="preserve">Days 1 through 60 following project handoff are complimentary. During this period, Provider will monitor systems, fix any build-related issues, tune ADESINA's scripts, and answer technical questions related to the Phase 1 build at no additional charge.</w:t>
+        <w:t xml:space="preserve">Beginning Month 1 (from the date of signing), the monthly retainer is $350.00 per month for an initial term of 6 months (Months 1–6), billed on the same calendar date each month. The first month's retainer ($350.00) is due at signing, concurrent with the setup deposit.</w:t>
+      </w:r>
+    </w:p>
+    <w:p>
+      <w:pPr>
+        <w:spacing w:after="60" w:before="0"/>
+      </w:pPr>
+    </w:p>
+    <w:p>
+      <w:pPr>
+        <w:spacing w:after="60" w:before="60"/>
+      </w:pPr>
+      <w:r>
+        <w:rPr>
+          <w:color w:val="111827"/>
+          <w:sz w:val="20"/>
+          <w:szCs w:val="20"/>
+        </w:rPr>
+        <w:t xml:space="preserve">The $350/month retainer covers:</w:t>
+      </w:r>
+    </w:p>
+    <w:p>
+      <w:pPr>
+        <w:spacing w:after="40" w:before="40"/>
+        <w:ind w:left="360"/>
+      </w:pPr>
+      <w:r>
+        <w:rPr>
+          <w:color w:val="111827"/>
+          <w:sz w:val="20"/>
+          <w:szCs w:val="20"/>
+        </w:rPr>
+        <w:t xml:space="preserve">•  Monitoring of ADESINA's availability, call handling performance, and webhook connections</w:t>
+      </w:r>
+    </w:p>
+    <w:p>
+      <w:pPr>
+        <w:spacing w:after="40" w:before="40"/>
+        <w:ind w:left="360"/>
+      </w:pPr>
+      <w:r>
+        <w:rPr>
+          <w:color w:val="111827"/>
+          <w:sz w:val="20"/>
+          <w:szCs w:val="20"/>
+        </w:rPr>
+        <w:t xml:space="preserve">•  Troubleshooting and fixing issues with the AI receptionist, CRM pipeline, booking automation, contract/payment links, and refund-approval workflow</w:t>
+      </w:r>
+    </w:p>
+    <w:p>
+      <w:pPr>
+        <w:spacing w:after="40" w:before="40"/>
+        <w:ind w:left="360"/>
+      </w:pPr>
+      <w:r>
+        <w:rPr>
+          <w:color w:val="111827"/>
+          <w:sz w:val="20"/>
+          <w:szCs w:val="20"/>
+        </w:rPr>
+        <w:t xml:space="preserve">•  Maintaining platform connections (11Labs ↔ Twilio ↔ N8N ↔ GHL ↔ Stripe)</w:t>
+      </w:r>
+    </w:p>
+    <w:p>
+      <w:pPr>
+        <w:spacing w:after="40" w:before="40"/>
+        <w:ind w:left="360"/>
+      </w:pPr>
+      <w:r>
+        <w:rPr>
+          <w:color w:val="111827"/>
+          <w:sz w:val="20"/>
+          <w:szCs w:val="20"/>
+        </w:rPr>
+        <w:t xml:space="preserve">•  Script updates to ADESINA (reasonable adjustments; major rebuild = change order)</w:t>
+      </w:r>
+    </w:p>
+    <w:p>
+      <w:pPr>
+        <w:spacing w:after="40" w:before="40"/>
+        <w:ind w:left="360"/>
+      </w:pPr>
+      <w:r>
+        <w:rPr>
+          <w:color w:val="111827"/>
+          <w:sz w:val="20"/>
+          <w:szCs w:val="20"/>
+        </w:rPr>
+        <w:t xml:space="preserve">•  Support hours: Monday–Friday, 9:00 AM – 5:00 PM Eastern Time</w:t>
+      </w:r>
+    </w:p>
+    <w:p>
+      <w:pPr>
+        <w:spacing w:after="40" w:before="40"/>
+        <w:ind w:left="360"/>
+      </w:pPr>
+      <w:r>
+        <w:rPr>
+          <w:color w:val="111827"/>
+          <w:sz w:val="20"/>
+          <w:szCs w:val="20"/>
+        </w:rPr>
+        <w:t xml:space="preserve">•  Evening coverage via Philippines-based team: Monday–Friday, 6:00 PM – 2:00 AM Eastern Time</w:t>
+      </w:r>
+    </w:p>
+    <w:p>
+      <w:pPr>
+        <w:spacing w:after="60" w:before="0"/>
+      </w:pPr>
+    </w:p>
+    <w:p>
+      <w:pPr>
+        <w:spacing w:after="60" w:before="60"/>
+      </w:pPr>
+      <w:r>
+        <w:rPr>
+          <w:color w:val="111827"/>
+          <w:sz w:val="20"/>
+          <w:szCs w:val="20"/>
+        </w:rPr>
+        <w:t xml:space="preserve">The $350/month retainer does NOT cover:</w:t>
+      </w:r>
+    </w:p>
+    <w:p>
+      <w:pPr>
+        <w:spacing w:after="40" w:before="40"/>
+        <w:ind w:left="360"/>
+      </w:pPr>
+      <w:r>
+        <w:rPr>
+          <w:color w:val="111827"/>
+          <w:sz w:val="20"/>
+          <w:szCs w:val="20"/>
+        </w:rPr>
+        <w:t xml:space="preserve">•  Lead generation, social media, Google Business Profile, or paid advertising (Phase 2 — separate engagement)</w:t>
+      </w:r>
+    </w:p>
+    <w:p>
+      <w:pPr>
+        <w:spacing w:after="40" w:before="40"/>
+        <w:ind w:left="360"/>
+      </w:pPr>
+      <w:r>
+        <w:rPr>
+          <w:color w:val="111827"/>
+          <w:sz w:val="20"/>
+          <w:szCs w:val="20"/>
+        </w:rPr>
+        <w:t xml:space="preserve">•  New builds or major feature additions (require a Change Order — see Section 8)</w:t>
+      </w:r>
+    </w:p>
+    <w:p>
+      <w:pPr>
+        <w:spacing w:after="40" w:before="40"/>
+        <w:ind w:left="360"/>
+      </w:pPr>
+      <w:r>
+        <w:rPr>
+          <w:color w:val="111827"/>
+          <w:sz w:val="20"/>
+          <w:szCs w:val="20"/>
+        </w:rPr>
+        <w:t xml:space="preserve">•  Third-party usage fees (Twilio, 11Labs, N8N, Stripe) — these are Client's direct responsibility (see Section 4)</w:t>
       </w:r>
     </w:p>
     <w:p>
@@ -1269,7 +1433,7 @@
           <w:sz w:val="22"/>
           <w:szCs w:val="22"/>
         </w:rPr>
-        <w:t xml:space="preserve">C.  Monthly Retainer — AI System Care</w:t>
+        <w:t xml:space="preserve">D.  Emergency After-Hours Support</w:t>
       </w:r>
     </w:p>
     <w:p>
@@ -1282,169 +1446,7 @@
           <w:sz w:val="20"/>
           <w:szCs w:val="20"/>
         </w:rPr>
-        <w:t xml:space="preserve">Beginning on Day 61, the monthly retainer is $350.00 per month for an initial term of 6 months (Months 3–8), billed on the same calendar date each month.</w:t>
-      </w:r>
-    </w:p>
-    <w:p>
-      <w:pPr>
-        <w:spacing w:after="60" w:before="0"/>
-      </w:pPr>
-    </w:p>
-    <w:p>
-      <w:pPr>
-        <w:spacing w:after="60" w:before="60"/>
-      </w:pPr>
-      <w:r>
-        <w:rPr>
-          <w:color w:val="111827"/>
-          <w:sz w:val="20"/>
-          <w:szCs w:val="20"/>
-        </w:rPr>
-        <w:t xml:space="preserve">The $350/month retainer covers:</w:t>
-      </w:r>
-    </w:p>
-    <w:p>
-      <w:pPr>
-        <w:spacing w:after="40" w:before="40"/>
-        <w:ind w:left="360"/>
-      </w:pPr>
-      <w:r>
-        <w:rPr>
-          <w:color w:val="111827"/>
-          <w:sz w:val="20"/>
-          <w:szCs w:val="20"/>
-        </w:rPr>
-        <w:t xml:space="preserve">•  Monitoring of ADESINA's availability, call handling performance, and webhook connections</w:t>
-      </w:r>
-    </w:p>
-    <w:p>
-      <w:pPr>
-        <w:spacing w:after="40" w:before="40"/>
-        <w:ind w:left="360"/>
-      </w:pPr>
-      <w:r>
-        <w:rPr>
-          <w:color w:val="111827"/>
-          <w:sz w:val="20"/>
-          <w:szCs w:val="20"/>
-        </w:rPr>
-        <w:t xml:space="preserve">•  Troubleshooting and fixing issues with the AI receptionist, CRM pipeline, booking automation, contract/payment links, and refund-approval workflow</w:t>
-      </w:r>
-    </w:p>
-    <w:p>
-      <w:pPr>
-        <w:spacing w:after="40" w:before="40"/>
-        <w:ind w:left="360"/>
-      </w:pPr>
-      <w:r>
-        <w:rPr>
-          <w:color w:val="111827"/>
-          <w:sz w:val="20"/>
-          <w:szCs w:val="20"/>
-        </w:rPr>
-        <w:t xml:space="preserve">•  Maintaining platform connections (11Labs ↔ Twilio ↔ N8N ↔ GHL ↔ Stripe)</w:t>
-      </w:r>
-    </w:p>
-    <w:p>
-      <w:pPr>
-        <w:spacing w:after="40" w:before="40"/>
-        <w:ind w:left="360"/>
-      </w:pPr>
-      <w:r>
-        <w:rPr>
-          <w:color w:val="111827"/>
-          <w:sz w:val="20"/>
-          <w:szCs w:val="20"/>
-        </w:rPr>
-        <w:t xml:space="preserve">•  Script updates to ADESINA (reasonable adjustments; major rebuild = change order)</w:t>
-      </w:r>
-    </w:p>
-    <w:p>
-      <w:pPr>
-        <w:spacing w:after="40" w:before="40"/>
-        <w:ind w:left="360"/>
-      </w:pPr>
-      <w:r>
-        <w:rPr>
-          <w:color w:val="111827"/>
-          <w:sz w:val="20"/>
-          <w:szCs w:val="20"/>
-        </w:rPr>
-        <w:t xml:space="preserve">•  Support hours: Monday–Friday, 9:00 AM – 5:00 PM Eastern Time</w:t>
-      </w:r>
-    </w:p>
-    <w:p>
-      <w:pPr>
-        <w:spacing w:after="40" w:before="40"/>
-        <w:ind w:left="360"/>
-      </w:pPr>
-      <w:r>
-        <w:rPr>
-          <w:color w:val="111827"/>
-          <w:sz w:val="20"/>
-          <w:szCs w:val="20"/>
-        </w:rPr>
-        <w:t xml:space="preserve">•  Evening coverage via Philippines-based team: Monday–Friday, 6:00 PM – 2:00 AM Eastern Time</w:t>
-      </w:r>
-    </w:p>
-    <w:p>
-      <w:pPr>
-        <w:spacing w:after="60" w:before="0"/>
-      </w:pPr>
-    </w:p>
-    <w:p>
-      <w:pPr>
-        <w:spacing w:after="60" w:before="60"/>
-      </w:pPr>
-      <w:r>
-        <w:rPr>
-          <w:color w:val="111827"/>
-          <w:sz w:val="20"/>
-          <w:szCs w:val="20"/>
-        </w:rPr>
-        <w:t xml:space="preserve">The $350/month retainer does NOT cover:</w:t>
-      </w:r>
-    </w:p>
-    <w:p>
-      <w:pPr>
-        <w:spacing w:after="40" w:before="40"/>
-        <w:ind w:left="360"/>
-      </w:pPr>
-      <w:r>
-        <w:rPr>
-          <w:color w:val="111827"/>
-          <w:sz w:val="20"/>
-          <w:szCs w:val="20"/>
-        </w:rPr>
-        <w:t xml:space="preserve">•  Lead generation, social media, Google Business Profile, or paid advertising (Phase 2 — separate engagement)</w:t>
-      </w:r>
-    </w:p>
-    <w:p>
-      <w:pPr>
-        <w:spacing w:after="40" w:before="40"/>
-        <w:ind w:left="360"/>
-      </w:pPr>
-      <w:r>
-        <w:rPr>
-          <w:color w:val="111827"/>
-          <w:sz w:val="20"/>
-          <w:szCs w:val="20"/>
-        </w:rPr>
-        <w:t xml:space="preserve">•  New builds or major feature additions (require a Change Order — see Section 8)</w:t>
-      </w:r>
-    </w:p>
-    <w:p>
-      <w:pPr>
-        <w:spacing w:after="40" w:before="40"/>
-        <w:ind w:left="360"/>
-      </w:pPr>
-      <w:r>
-        <w:rPr>
-          <w:color w:val="111827"/>
-          <w:sz w:val="20"/>
-          <w:szCs w:val="20"/>
-        </w:rPr>
-        <w:t xml:space="preserve">•  Third-party usage fees (Twilio, 11Labs, N8N, Stripe) — these are Client's direct responsibility (see Section 4)</w:t>
+        <w:t xml:space="preserve">Emergency support outside of covered hours (Saturdays, Sundays, and weekdays 2:00 AM–9:00 AM ET) is available at $150.00 per hour, subject to availability. Provider will make reasonable efforts to respond but cannot guarantee availability outside standard hours.</w:t>
       </w:r>
     </w:p>
     <w:p>
@@ -1464,7 +1466,7 @@
           <w:sz w:val="22"/>
           <w:szCs w:val="22"/>
         </w:rPr>
-        <w:t xml:space="preserve">D.  Emergency After-Hours Support</w:t>
+        <w:t xml:space="preserve">E.  Payment Terms</w:t>
       </w:r>
     </w:p>
     <w:p>
@@ -1477,40 +1479,7 @@
           <w:sz w:val="20"/>
           <w:szCs w:val="20"/>
         </w:rPr>
-        <w:t xml:space="preserve">Emergency support outside of covered hours (Saturdays, Sundays, and weekdays 2:00 AM–9:00 AM ET) is available at $150.00 per hour, subject to availability. Provider will make reasonable efforts to respond but cannot guarantee availability outside standard hours.</w:t>
-      </w:r>
-    </w:p>
-    <w:p>
-      <w:pPr>
-        <w:spacing w:after="60" w:before="0"/>
-      </w:pPr>
-    </w:p>
-    <w:p>
-      <w:pPr>
-        <w:spacing w:after="60" w:before="200"/>
-      </w:pPr>
-      <w:r>
-        <w:rPr>
-          <w:b/>
-          <w:bCs/>
-          <w:color w:val="1d3557"/>
-          <w:sz w:val="22"/>
-          <w:szCs w:val="22"/>
-        </w:rPr>
-        <w:t xml:space="preserve">E.  Payment Terms</w:t>
-      </w:r>
-    </w:p>
-    <w:p>
-      <w:pPr>
-        <w:spacing w:after="60" w:before="60"/>
-      </w:pPr>
-      <w:r>
-        <w:rPr>
-          <w:color w:val="111827"/>
-          <w:sz w:val="20"/>
-          <w:szCs w:val="20"/>
-        </w:rPr>
-        <w:t xml:space="preserve">Setup fee ($2,500) is due in full before project work commences. Monthly retainer is due on the 1st of each calendar month beginning on Month 3 (Day 61+). A late fee of $25.00 applies to invoices unpaid after 7 days. Accepted payment methods: Stripe, Zelle, or as agreed in writing.</w:t>
+        <w:t xml:space="preserve">Payment schedule: (1) $2,000.00 deposit due at signing; (2) $350.00 first month retainer due at signing; (3) $1,500.00 balance due within three (3) weeks of signing date. Monthly retainer of $350.00 is due on the same calendar date each month beginning Month 2. Autopay enrollment is required at signing — the AI system will not be delivered or activated until the full $3,500.00 setup fee is paid in full and autopay is active. A late fee of $25.00 applies to invoices unpaid after 7 days. Accepted payment methods: Stripe autopay (required for monthly retainer), Zelle, or as agreed in writing.</w:t>
       </w:r>
     </w:p>
     <w:p>
@@ -2469,7 +2438,7 @@
           <w:sz w:val="20"/>
           <w:szCs w:val="20"/>
         </w:rPr>
-        <w:t xml:space="preserve">Either party may terminate this Agreement with fourteen (14) days written notice via email. Upon termination: (a) Client shall pay for all work completed through the termination date; (b) Provider shall deliver all completed work product; (c) the $2,500 setup fee is non-refundable. </w:t>
+        <w:t xml:space="preserve">Either party may terminate this Agreement with fourteen (14) days written notice via email. Upon termination: (a) Client shall pay for all work completed through the termination date; (b) Provider shall deliver all completed work product; (c) the $3,500 setup fee is non-refundable. </w:t>
       </w:r>
     </w:p>
     <w:p>
@@ -2496,7 +2465,7 @@
           <w:sz w:val="22"/>
           <w:szCs w:val="22"/>
         </w:rPr>
-        <w:t xml:space="preserve">After the initial 6-month AI System Care term (Month 8), Client may upgrade to Phase 2: AI System Care + Social Visibility + Lead Generation + FB Ads at $1,394.00/month. FB advertising spend is billed directly and separately. Phase 2 has not been selected at this time and is not active under this Agreement.</w:t>
+        <w:t xml:space="preserve">After the initial 6-month AI System Care term (Month 6), Client may upgrade to Phase 2: AI System Care + Social Visibility + Lead Generation + FB Ads at $1,394.00/month. FB advertising spend is billed directly and separately. Phase 2 has not been selected at this time and is not active under this Agreement.</w:t>
       </w:r>
     </w:p>
     <w:p>

</xml_diff>